<commit_message>
changes for Profile Picture in ALl format file
</commit_message>
<xml_diff>
--- a/backend/template/NTT_DATA_Master_Templates_de.docx
+++ b/backend/template/NTT_DATA_Master_Templates_de.docx
@@ -79,14 +79,50 @@
           </w:p>
           <w:p>
             <w:pPr>
+              <w:jc w:val="center"/>
+            </w:pPr>
+            <w:bookmarkStart w:id="0" w:name="PROFILE_PHOTO"/>
+            <w:proofErr w:type="gramStart"/>
+            <w:r>
+              <w:t xml:space="preserve">{{ </w:t>
+            </w:r>
+            <w:proofErr w:type="spellStart"/>
+            <w:r>
+              <w:t>profile</w:t>
+            </w:r>
+            <w:proofErr w:type="gramEnd"/>
+            <w:r>
+              <w:t>_</w:t>
+            </w:r>
+            <w:proofErr w:type="gramStart"/>
+            <w:r>
+              <w:t>pic</w:t>
+            </w:r>
+            <w:proofErr w:type="spellEnd"/>
+            <w:r>
+              <w:t xml:space="preserve"> }</w:t>
+            </w:r>
+            <w:proofErr w:type="gramEnd"/>
+            <w:r>
+              <w:t>}</w:t>
+            </w:r>
+            <w:bookmarkEnd w:id="0"/>
+          </w:p>
+          <w:p>
+            <w:pPr>
               <w:pStyle w:val="Heading2"/>
               <w:spacing w:line="240" w:lineRule="auto"/>
               <w:jc w:val="center"/>
             </w:pPr>
             <w:proofErr w:type="gramStart"/>
             <w:r>
-              <w:t>{{ fullName</w:t>
-            </w:r>
+              <w:t xml:space="preserve">{{ </w:t>
+            </w:r>
+            <w:proofErr w:type="spellStart"/>
+            <w:r>
+              <w:t>fullName</w:t>
+            </w:r>
+            <w:proofErr w:type="spellEnd"/>
             <w:proofErr w:type="gramEnd"/>
             <w:r>
               <w:t xml:space="preserve"> }}</w:t>
@@ -101,9 +137,11 @@
             <w:r>
               <w:t xml:space="preserve">{{ </w:t>
             </w:r>
+            <w:proofErr w:type="spellStart"/>
             <w:r>
               <w:t>jobTitle</w:t>
             </w:r>
+            <w:proofErr w:type="spellEnd"/>
             <w:proofErr w:type="gramEnd"/>
             <w:r>
               <w:t xml:space="preserve"> </w:t>
@@ -347,8 +385,18 @@
                 <w:sz w:val="22"/>
                 <w:szCs w:val="22"/>
               </w:rPr>
-              <w:t>{{ profSummary</w:t>
-            </w:r>
+              <w:t xml:space="preserve">{{ </w:t>
+            </w:r>
+            <w:proofErr w:type="spellStart"/>
+            <w:r>
+              <w:rPr>
+                <w:rFonts w:ascii="Arial" w:hAnsi="Arial" w:cs="Arial"/>
+                <w:sz w:val="22"/>
+                <w:szCs w:val="22"/>
+              </w:rPr>
+              <w:t>profSummary</w:t>
+            </w:r>
+            <w:proofErr w:type="spellEnd"/>
             <w:proofErr w:type="gramEnd"/>
             <w:r>
               <w:rPr>
@@ -376,6 +424,7 @@
               </w:rPr>
               <w:t xml:space="preserve">{%p </w:t>
             </w:r>
+            <w:proofErr w:type="spellStart"/>
             <w:proofErr w:type="gramStart"/>
             <w:r>
               <w:rPr>
@@ -383,7 +432,16 @@
                 <w:sz w:val="22"/>
                 <w:szCs w:val="22"/>
               </w:rPr>
-              <w:t>endfor %}</w:t>
+              <w:t>endfor</w:t>
+            </w:r>
+            <w:proofErr w:type="spellEnd"/>
+            <w:r>
+              <w:rPr>
+                <w:rFonts w:ascii="Arial" w:hAnsi="Arial" w:cs="Arial"/>
+                <w:sz w:val="22"/>
+                <w:szCs w:val="22"/>
+              </w:rPr>
+              <w:t xml:space="preserve"> %}</w:t>
             </w:r>
             <w:proofErr w:type="gramEnd"/>
           </w:p>
@@ -500,20 +558,38 @@
                     <w:framePr w:hSpace="180" w:wrap="around" w:hAnchor="margin" w:y="435"/>
                     <w:spacing w:before="0" w:after="0" w:line="240" w:lineRule="auto"/>
                   </w:pPr>
+                  <w:proofErr w:type="spellStart"/>
                   <w:r>
-                    <w:t>Primäre Fähigkeiten</w:t>
+                    <w:t>Primäre</w:t>
                   </w:r>
+                  <w:proofErr w:type="spellEnd"/>
+                  <w:r>
+                    <w:t xml:space="preserve"> </w:t>
+                  </w:r>
+                  <w:proofErr w:type="spellStart"/>
+                  <w:r>
+                    <w:t>Fähigkeiten</w:t>
+                  </w:r>
+                  <w:proofErr w:type="spellEnd"/>
                 </w:p>
                 <w:p>
                   <w:pPr>
                     <w:framePr w:hSpace="180" w:wrap="around" w:hAnchor="margin" w:y="435"/>
                   </w:pPr>
                   <w:r>
-                    <w:t>{%p for skill in technicalSkills.</w:t>
+                    <w:t xml:space="preserve">{%p for skill in </w:t>
+                  </w:r>
+                  <w:proofErr w:type="spellStart"/>
+                  <w:r>
+                    <w:t>technicalSkills.</w:t>
                   </w:r>
                   <w:proofErr w:type="gramStart"/>
                   <w:r>
-                    <w:t>primary%}</w:t>
+                    <w:t>primary</w:t>
+                  </w:r>
+                  <w:proofErr w:type="spellEnd"/>
+                  <w:r>
+                    <w:t>%}</w:t>
                   </w:r>
                   <w:proofErr w:type="gramEnd"/>
                 </w:p>
@@ -528,7 +604,11 @@
                   </w:pPr>
                   <w:proofErr w:type="gramStart"/>
                   <w:r>
-                    <w:t>{{ skill</w:t>
+                    <w:t xml:space="preserve">{{ </w:t>
+                  </w:r>
+                  <w:proofErr w:type="spellStart"/>
+                  <w:r>
+                    <w:t>skill</w:t>
                   </w:r>
                   <w:proofErr w:type="gramEnd"/>
                   <w:r>
@@ -536,7 +616,11 @@
                   </w:r>
                   <w:proofErr w:type="gramStart"/>
                   <w:r>
-                    <w:t>skillName }</w:t>
+                    <w:t>skillName</w:t>
+                  </w:r>
+                  <w:proofErr w:type="spellEnd"/>
+                  <w:r>
+                    <w:t xml:space="preserve"> }</w:t>
                   </w:r>
                   <w:proofErr w:type="gramEnd"/>
                   <w:r>
@@ -550,9 +634,14 @@
                   <w:r>
                     <w:t xml:space="preserve">{%p </w:t>
                   </w:r>
+                  <w:proofErr w:type="spellStart"/>
                   <w:proofErr w:type="gramStart"/>
                   <w:r>
-                    <w:t>endfor %}</w:t>
+                    <w:t>endfor</w:t>
+                  </w:r>
+                  <w:proofErr w:type="spellEnd"/>
+                  <w:r>
+                    <w:t xml:space="preserve"> %}</w:t>
                   </w:r>
                   <w:proofErr w:type="gramEnd"/>
                 </w:p>
@@ -562,20 +651,38 @@
                     <w:framePr w:hSpace="180" w:wrap="around" w:hAnchor="margin" w:y="435"/>
                     <w:spacing w:before="0" w:after="0" w:line="240" w:lineRule="auto"/>
                   </w:pPr>
+                  <w:proofErr w:type="spellStart"/>
                   <w:r>
-                    <w:t>Sekundäre Fähigkeiten</w:t>
+                    <w:t>Sekundäre</w:t>
                   </w:r>
+                  <w:proofErr w:type="spellEnd"/>
+                  <w:r>
+                    <w:t xml:space="preserve"> </w:t>
+                  </w:r>
+                  <w:proofErr w:type="spellStart"/>
+                  <w:r>
+                    <w:t>Fähigkeiten</w:t>
+                  </w:r>
+                  <w:proofErr w:type="spellEnd"/>
                 </w:p>
                 <w:p>
                   <w:pPr>
                     <w:framePr w:hSpace="180" w:wrap="around" w:hAnchor="margin" w:y="435"/>
                   </w:pPr>
                   <w:r>
-                    <w:t>{%p for skill in technicalSkills.</w:t>
+                    <w:t xml:space="preserve">{%p for skill in </w:t>
+                  </w:r>
+                  <w:proofErr w:type="spellStart"/>
+                  <w:r>
+                    <w:t>technicalSkills.</w:t>
                   </w:r>
                   <w:proofErr w:type="gramStart"/>
                   <w:r>
-                    <w:t>secondary%}</w:t>
+                    <w:t>secondary</w:t>
+                  </w:r>
+                  <w:proofErr w:type="spellEnd"/>
+                  <w:r>
+                    <w:t>%}</w:t>
                   </w:r>
                   <w:proofErr w:type="gramEnd"/>
                 </w:p>
@@ -590,7 +697,11 @@
                   </w:pPr>
                   <w:proofErr w:type="gramStart"/>
                   <w:r>
-                    <w:t>{{ skill</w:t>
+                    <w:t xml:space="preserve">{{ </w:t>
+                  </w:r>
+                  <w:proofErr w:type="spellStart"/>
+                  <w:r>
+                    <w:t>skill</w:t>
                   </w:r>
                   <w:proofErr w:type="gramEnd"/>
                   <w:r>
@@ -598,7 +709,11 @@
                   </w:r>
                   <w:proofErr w:type="gramStart"/>
                   <w:r>
-                    <w:t>skillName }</w:t>
+                    <w:t>skillName</w:t>
+                  </w:r>
+                  <w:proofErr w:type="spellEnd"/>
+                  <w:r>
+                    <w:t xml:space="preserve"> }</w:t>
                   </w:r>
                   <w:proofErr w:type="gramEnd"/>
                   <w:r>
@@ -612,9 +727,14 @@
                   <w:r>
                     <w:t xml:space="preserve">{%p </w:t>
                   </w:r>
+                  <w:proofErr w:type="spellStart"/>
                   <w:proofErr w:type="gramStart"/>
                   <w:r>
-                    <w:t>endfor %}</w:t>
+                    <w:t>endfor</w:t>
+                  </w:r>
+                  <w:proofErr w:type="spellEnd"/>
+                  <w:r>
+                    <w:t xml:space="preserve"> %}</w:t>
                   </w:r>
                   <w:proofErr w:type="gramEnd"/>
                 </w:p>
@@ -710,9 +830,11 @@
               <w:pStyle w:val="Heading2"/>
               <w:spacing w:before="0" w:after="0" w:line="240" w:lineRule="auto"/>
             </w:pPr>
+            <w:proofErr w:type="spellStart"/>
             <w:r>
               <w:t>Berufserfahrung</w:t>
             </w:r>
+            <w:proofErr w:type="spellEnd"/>
           </w:p>
           <w:p/>
           <w:p>
@@ -738,7 +860,11 @@
             </w:r>
             <w:proofErr w:type="gramStart"/>
             <w:r>
-              <w:t>{{ exp</w:t>
+              <w:t xml:space="preserve">{{ </w:t>
+            </w:r>
+            <w:proofErr w:type="spellStart"/>
+            <w:r>
+              <w:t>exp</w:t>
             </w:r>
             <w:proofErr w:type="gramEnd"/>
             <w:r>
@@ -746,7 +872,11 @@
             </w:r>
             <w:proofErr w:type="gramStart"/>
             <w:r>
-              <w:t>company }</w:t>
+              <w:t>company</w:t>
+            </w:r>
+            <w:proofErr w:type="spellEnd"/>
+            <w:r>
+              <w:t xml:space="preserve"> }</w:t>
             </w:r>
             <w:proofErr w:type="gramEnd"/>
             <w:r>
@@ -754,7 +884,11 @@
             </w:r>
             <w:proofErr w:type="gramStart"/>
             <w:r>
-              <w:t xml:space="preserve">   {{ exp</w:t>
+              <w:t xml:space="preserve">   {{ </w:t>
+            </w:r>
+            <w:proofErr w:type="spellStart"/>
+            <w:r>
+              <w:t>exp</w:t>
             </w:r>
             <w:proofErr w:type="gramEnd"/>
             <w:r>
@@ -762,7 +896,11 @@
             </w:r>
             <w:proofErr w:type="gramStart"/>
             <w:r>
-              <w:t>startDate }</w:t>
+              <w:t>startDate</w:t>
+            </w:r>
+            <w:proofErr w:type="spellEnd"/>
+            <w:r>
+              <w:t xml:space="preserve"> }</w:t>
             </w:r>
             <w:proofErr w:type="gramEnd"/>
             <w:r>
@@ -770,7 +908,11 @@
             </w:r>
             <w:proofErr w:type="gramStart"/>
             <w:r>
-              <w:t>{{ exp</w:t>
+              <w:t xml:space="preserve">{{ </w:t>
+            </w:r>
+            <w:proofErr w:type="spellStart"/>
+            <w:r>
+              <w:t>exp</w:t>
             </w:r>
             <w:proofErr w:type="gramEnd"/>
             <w:r>
@@ -778,7 +920,11 @@
             </w:r>
             <w:proofErr w:type="gramStart"/>
             <w:r>
-              <w:t>endDate }</w:t>
+              <w:t>endDate</w:t>
+            </w:r>
+            <w:proofErr w:type="spellEnd"/>
+            <w:r>
+              <w:t xml:space="preserve"> }</w:t>
             </w:r>
             <w:proofErr w:type="gramEnd"/>
             <w:r>
@@ -798,7 +944,11 @@
             </w:r>
             <w:proofErr w:type="gramStart"/>
             <w:r>
-              <w:t>{{ exp</w:t>
+              <w:t xml:space="preserve">{{ </w:t>
+            </w:r>
+            <w:proofErr w:type="spellStart"/>
+            <w:r>
+              <w:t>exp</w:t>
             </w:r>
             <w:proofErr w:type="gramEnd"/>
             <w:r>
@@ -806,7 +956,11 @@
             </w:r>
             <w:proofErr w:type="gramStart"/>
             <w:r>
-              <w:t>title }</w:t>
+              <w:t>title</w:t>
+            </w:r>
+            <w:proofErr w:type="spellEnd"/>
+            <w:r>
+              <w:t xml:space="preserve"> }</w:t>
             </w:r>
             <w:proofErr w:type="gramEnd"/>
             <w:r>
@@ -819,7 +973,6 @@
                 <w:b/>
                 <w:bCs/>
               </w:rPr>
-              <w:lastRenderedPageBreak/>
               <w:t>Client</w:t>
             </w:r>
             <w:r>
@@ -827,7 +980,11 @@
             </w:r>
             <w:proofErr w:type="gramStart"/>
             <w:r>
-              <w:t>{{ exp</w:t>
+              <w:t xml:space="preserve">{{ </w:t>
+            </w:r>
+            <w:proofErr w:type="spellStart"/>
+            <w:r>
+              <w:t>exp</w:t>
             </w:r>
             <w:proofErr w:type="gramEnd"/>
             <w:r>
@@ -835,7 +992,11 @@
             </w:r>
             <w:proofErr w:type="gramStart"/>
             <w:r>
-              <w:t>clients }</w:t>
+              <w:t>clients</w:t>
+            </w:r>
+            <w:proofErr w:type="spellEnd"/>
+            <w:r>
+              <w:t xml:space="preserve"> }</w:t>
             </w:r>
             <w:proofErr w:type="gramEnd"/>
             <w:r>
@@ -855,7 +1016,11 @@
             </w:r>
             <w:proofErr w:type="gramStart"/>
             <w:r>
-              <w:t>{{ exp</w:t>
+              <w:t xml:space="preserve">{{ </w:t>
+            </w:r>
+            <w:proofErr w:type="spellStart"/>
+            <w:r>
+              <w:t>exp</w:t>
             </w:r>
             <w:proofErr w:type="gramEnd"/>
             <w:r>
@@ -863,7 +1028,11 @@
             </w:r>
             <w:proofErr w:type="gramStart"/>
             <w:r>
-              <w:t>projectName }</w:t>
+              <w:t>projectName</w:t>
+            </w:r>
+            <w:proofErr w:type="spellEnd"/>
+            <w:r>
+              <w:t xml:space="preserve"> }</w:t>
             </w:r>
             <w:proofErr w:type="gramEnd"/>
             <w:r>
@@ -883,7 +1052,11 @@
             </w:r>
             <w:proofErr w:type="gramStart"/>
             <w:r>
-              <w:t>{{ exp</w:t>
+              <w:t xml:space="preserve">{{ </w:t>
+            </w:r>
+            <w:proofErr w:type="spellStart"/>
+            <w:r>
+              <w:t>exp</w:t>
             </w:r>
             <w:proofErr w:type="gramEnd"/>
             <w:r>
@@ -891,7 +1064,11 @@
             </w:r>
             <w:proofErr w:type="gramStart"/>
             <w:r>
-              <w:t>projectDescription }</w:t>
+              <w:t>projectDescription</w:t>
+            </w:r>
+            <w:proofErr w:type="spellEnd"/>
+            <w:r>
+              <w:t xml:space="preserve"> }</w:t>
             </w:r>
             <w:proofErr w:type="gramEnd"/>
             <w:r>
@@ -914,6 +1091,7 @@
             <w:r>
               <w:t xml:space="preserve">{%p for item in </w:t>
             </w:r>
+            <w:proofErr w:type="spellStart"/>
             <w:proofErr w:type="gramStart"/>
             <w:r>
               <w:t>exp.</w:t>
@@ -921,6 +1099,7 @@
             <w:r>
               <w:t>achievements</w:t>
             </w:r>
+            <w:proofErr w:type="spellEnd"/>
             <w:proofErr w:type="gramEnd"/>
             <w:r>
               <w:t xml:space="preserve"> %}</w:t>
@@ -947,9 +1126,14 @@
             <w:r>
               <w:t xml:space="preserve">{%p </w:t>
             </w:r>
+            <w:proofErr w:type="spellStart"/>
             <w:proofErr w:type="gramStart"/>
             <w:r>
-              <w:t>endfor %}</w:t>
+              <w:t>endfor</w:t>
+            </w:r>
+            <w:proofErr w:type="spellEnd"/>
+            <w:r>
+              <w:t xml:space="preserve"> %}</w:t>
             </w:r>
             <w:proofErr w:type="gramEnd"/>
           </w:p>
@@ -958,9 +1142,14 @@
             <w:r>
               <w:t xml:space="preserve">{%p </w:t>
             </w:r>
+            <w:proofErr w:type="spellStart"/>
             <w:proofErr w:type="gramStart"/>
             <w:r>
-              <w:t>endfor %}</w:t>
+              <w:t>endfor</w:t>
+            </w:r>
+            <w:proofErr w:type="spellEnd"/>
+            <w:r>
+              <w:t xml:space="preserve"> %}</w:t>
             </w:r>
             <w:proofErr w:type="gramEnd"/>
           </w:p>
@@ -1040,9 +1229,11 @@
               <w:pStyle w:val="Heading2"/>
               <w:spacing w:before="0" w:after="0" w:line="240" w:lineRule="auto"/>
             </w:pPr>
+            <w:proofErr w:type="spellStart"/>
             <w:r>
               <w:t>Ausbildung</w:t>
             </w:r>
+            <w:proofErr w:type="spellEnd"/>
           </w:p>
           <w:p/>
           <w:p>
@@ -1093,6 +1284,7 @@
             <w:r>
               <w:t xml:space="preserve">{{ </w:t>
             </w:r>
+            <w:proofErr w:type="spellStart"/>
             <w:r>
               <w:t>education</w:t>
             </w:r>
@@ -1102,7 +1294,11 @@
             </w:r>
             <w:proofErr w:type="gramStart"/>
             <w:r>
-              <w:t xml:space="preserve">degree </w:t>
+              <w:t>degree</w:t>
+            </w:r>
+            <w:proofErr w:type="spellEnd"/>
+            <w:r>
+              <w:t xml:space="preserve"> </w:t>
             </w:r>
             <w:r>
               <w:t xml:space="preserve"> }</w:t>
@@ -1121,6 +1317,7 @@
             <w:r>
               <w:t xml:space="preserve"> {{ </w:t>
             </w:r>
+            <w:proofErr w:type="spellStart"/>
             <w:r>
               <w:t>education</w:t>
             </w:r>
@@ -1130,7 +1327,11 @@
             </w:r>
             <w:proofErr w:type="gramStart"/>
             <w:r>
-              <w:t>field }</w:t>
+              <w:t>field</w:t>
+            </w:r>
+            <w:proofErr w:type="spellEnd"/>
+            <w:r>
+              <w:t xml:space="preserve"> }</w:t>
             </w:r>
             <w:proofErr w:type="gramEnd"/>
             <w:r>
@@ -1141,9 +1342,14 @@
             <w:r>
               <w:t xml:space="preserve">{%p </w:t>
             </w:r>
+            <w:proofErr w:type="spellStart"/>
             <w:proofErr w:type="gramStart"/>
             <w:r>
-              <w:t>endfor %}</w:t>
+              <w:t>endfor</w:t>
+            </w:r>
+            <w:proofErr w:type="spellEnd"/>
+            <w:r>
+              <w:t xml:space="preserve"> %}</w:t>
             </w:r>
             <w:proofErr w:type="gramEnd"/>
           </w:p>
@@ -1153,8 +1359,13 @@
               <w:pStyle w:val="Heading2"/>
               <w:spacing w:before="0" w:line="240" w:lineRule="auto"/>
             </w:pPr>
-            <w:r>
-              <w:t xml:space="preserve">Zertifizierungen </w:t>
+            <w:proofErr w:type="spellStart"/>
+            <w:r>
+              <w:t>Zertifizierungen</w:t>
+            </w:r>
+            <w:proofErr w:type="spellEnd"/>
+            <w:r>
+              <w:t xml:space="preserve"> </w:t>
             </w:r>
             <w:r>
               <w:t xml:space="preserve"> </w:t>
@@ -1242,7 +1453,16 @@
                 <w:sz w:val="22"/>
                 <w:szCs w:val="22"/>
               </w:rPr>
-              <w:t>{{ cert</w:t>
+              <w:t xml:space="preserve">{{ </w:t>
+            </w:r>
+            <w:proofErr w:type="spellStart"/>
+            <w:r>
+              <w:rPr>
+                <w:rFonts w:ascii="Arial" w:hAnsi="Arial" w:cs="Arial"/>
+                <w:sz w:val="22"/>
+                <w:szCs w:val="22"/>
+              </w:rPr>
+              <w:t>cert</w:t>
             </w:r>
             <w:proofErr w:type="gramEnd"/>
             <w:r>
@@ -1260,7 +1480,16 @@
                 <w:sz w:val="22"/>
                 <w:szCs w:val="22"/>
               </w:rPr>
-              <w:t>issuer }</w:t>
+              <w:t>issuer</w:t>
+            </w:r>
+            <w:proofErr w:type="spellEnd"/>
+            <w:r>
+              <w:rPr>
+                <w:rFonts w:ascii="Arial" w:hAnsi="Arial" w:cs="Arial"/>
+                <w:sz w:val="22"/>
+                <w:szCs w:val="22"/>
+              </w:rPr>
+              <w:t xml:space="preserve"> }</w:t>
             </w:r>
             <w:proofErr w:type="gramEnd"/>
             <w:r>
@@ -1288,6 +1517,7 @@
               </w:rPr>
               <w:t xml:space="preserve">{%p </w:t>
             </w:r>
+            <w:proofErr w:type="spellStart"/>
             <w:proofErr w:type="gramStart"/>
             <w:r>
               <w:rPr>
@@ -1295,7 +1525,16 @@
                 <w:sz w:val="22"/>
                 <w:szCs w:val="22"/>
               </w:rPr>
-              <w:t>endfor %}</w:t>
+              <w:t>endfor</w:t>
+            </w:r>
+            <w:proofErr w:type="spellEnd"/>
+            <w:r>
+              <w:rPr>
+                <w:rFonts w:ascii="Arial" w:hAnsi="Arial" w:cs="Arial"/>
+                <w:sz w:val="22"/>
+                <w:szCs w:val="22"/>
+              </w:rPr>
+              <w:t xml:space="preserve"> %}</w:t>
             </w:r>
             <w:proofErr w:type="gramEnd"/>
           </w:p>
@@ -5953,6 +6192,15 @@
 </file>
 
 <file path=customXml/item1.xml><?xml version="1.0" encoding="utf-8"?>
+<?mso-contentType ?>
+<FormTemplates xmlns="http://schemas.microsoft.com/sharepoint/v3/contenttype/forms">
+  <Display>DocumentLibraryForm</Display>
+  <Edit>DocumentLibraryForm</Edit>
+  <New>DocumentLibraryForm</New>
+</FormTemplates>
+</file>
+
+<file path=customXml/item2.xml><?xml version="1.0" encoding="utf-8"?>
 <ct:contentTypeSchema xmlns:ct="http://schemas.microsoft.com/office/2006/metadata/contentType" xmlns:ma="http://schemas.microsoft.com/office/2006/metadata/properties/metaAttributes" ct:_="" ma:_="" ma:contentTypeName="Document" ma:contentTypeID="0x0101001E38EA68A930BD46B01877FE0E57C759" ma:contentTypeVersion="16" ma:contentTypeDescription="Create a new document." ma:contentTypeScope="" ma:versionID="b6cd807e6e26a14c07b7465fe5f5751a">
   <xsd:schema xmlns:xsd="http://www.w3.org/2001/XMLSchema" xmlns:xs="http://www.w3.org/2001/XMLSchema" xmlns:p="http://schemas.microsoft.com/office/2006/metadata/properties" xmlns:ns2="825b4f20-597c-4909-bc0b-368dce048b6f" xmlns:ns3="88277476-d7b8-4914-a8c1-9da81a4263ec" targetNamespace="http://schemas.microsoft.com/office/2006/metadata/properties" ma:root="true" ma:fieldsID="5b294db8e546cc00891ba7de715fede2" ns2:_="" ns3:_="">
     <xsd:import namespace="825b4f20-597c-4909-bc0b-368dce048b6f"/>
@@ -6179,15 +6427,6 @@
 </ct:contentTypeSchema>
 </file>
 
-<file path=customXml/item2.xml><?xml version="1.0" encoding="utf-8"?>
-<?mso-contentType ?>
-<FormTemplates xmlns="http://schemas.microsoft.com/sharepoint/v3/contenttype/forms">
-  <Display>DocumentLibraryForm</Display>
-  <Edit>DocumentLibraryForm</Edit>
-  <New>DocumentLibraryForm</New>
-</FormTemplates>
-</file>
-
 <file path=customXml/item3.xml><?xml version="1.0" encoding="utf-8"?>
 <p:properties xmlns:p="http://schemas.microsoft.com/office/2006/metadata/properties" xmlns:xsi="http://www.w3.org/2001/XMLSchema-instance" xmlns:pc="http://schemas.microsoft.com/office/infopath/2007/PartnerControls">
   <documentManagement>
@@ -6200,6 +6439,14 @@
 </file>
 
 <file path=customXml/itemProps1.xml><?xml version="1.0" encoding="utf-8"?>
+<ds:datastoreItem xmlns:ds="http://schemas.openxmlformats.org/officeDocument/2006/customXml" ds:itemID="{1BA90A2F-8B0E-4DA6-B84C-5650BE5F9A62}">
+  <ds:schemaRefs>
+    <ds:schemaRef ds:uri="http://schemas.microsoft.com/sharepoint/v3/contenttype/forms"/>
+  </ds:schemaRefs>
+</ds:datastoreItem>
+</file>
+
+<file path=customXml/itemProps2.xml><?xml version="1.0" encoding="utf-8"?>
 <ds:datastoreItem xmlns:ds="http://schemas.openxmlformats.org/officeDocument/2006/customXml" ds:itemID="{348A0A66-D218-45F0-B01F-7FA602CD2750}">
   <ds:schemaRefs>
     <ds:schemaRef ds:uri="http://schemas.microsoft.com/office/2006/metadata/contentType"/>
@@ -6218,14 +6465,6 @@
 </ds:datastoreItem>
 </file>
 
-<file path=customXml/itemProps2.xml><?xml version="1.0" encoding="utf-8"?>
-<ds:datastoreItem xmlns:ds="http://schemas.openxmlformats.org/officeDocument/2006/customXml" ds:itemID="{1BA90A2F-8B0E-4DA6-B84C-5650BE5F9A62}">
-  <ds:schemaRefs>
-    <ds:schemaRef ds:uri="http://schemas.microsoft.com/sharepoint/v3/contenttype/forms"/>
-  </ds:schemaRefs>
-</ds:datastoreItem>
-</file>
-
 <file path=customXml/itemProps3.xml><?xml version="1.0" encoding="utf-8"?>
 <ds:datastoreItem xmlns:ds="http://schemas.openxmlformats.org/officeDocument/2006/customXml" ds:itemID="{94ACB0AA-19CB-4A86-8E58-EBBD44A97BCC}">
   <ds:schemaRefs>

</xml_diff>